<commit_message>
ingestion & cleaning is donoe
</commit_message>
<xml_diff>
--- a/Notes_related_project.docx
+++ b/Notes_related_project.docx
@@ -1016,11 +1016,131 @@
         <w:t>Does retrieval actually work?</w:t>
       </w:r>
     </w:p>
-    <w:p/>
-    <w:p/>
-    <w:p/>
-    <w:p/>
-    <w:p/>
+    <w:p>
+      <w:pPr>
+        <w:pBdr>
+          <w:top w:val="single" w:sz="6" w:space="1" w:color="auto"/>
+          <w:bottom w:val="single" w:sz="6" w:space="1" w:color="auto"/>
+        </w:pBdr>
+      </w:pPr>
+    </w:p>
+    <w:p>
+      <w:pPr>
+        <w:rPr>
+          <w:b/>
+          <w:bCs/>
+        </w:rPr>
+      </w:pPr>
+      <w:r>
+        <w:t xml:space="preserve"> Download </w:t>
+      </w:r>
+      <w:r>
+        <w:rPr>
+          <w:highlight w:val="yellow"/>
+        </w:rPr>
+        <w:t>Jupyter</w:t>
+      </w:r>
+      <w:r>
+        <w:t xml:space="preserve">  notebook to </w:t>
+      </w:r>
+      <w:r>
+        <w:rPr>
+          <w:b/>
+          <w:bCs/>
+          <w:highlight w:val="yellow"/>
+        </w:rPr>
+        <w:t>Virtual environment</w:t>
+      </w:r>
+    </w:p>
+    <w:p>
+      <w:pPr>
+        <w:rPr>
+          <w:b/>
+          <w:bCs/>
+        </w:rPr>
+      </w:pPr>
+      <w:r>
+        <w:t>1.</w:t>
+      </w:r>
+      <w:r>
+        <w:rPr>
+          <w:b/>
+          <w:bCs/>
+        </w:rPr>
+        <w:t xml:space="preserve"> </w:t>
+      </w:r>
+      <w:r>
+        <w:rPr>
+          <w:b/>
+          <w:bCs/>
+        </w:rPr>
+        <w:t>.venv\Script\activate</w:t>
+      </w:r>
+    </w:p>
+    <w:p>
+      <w:r>
+        <w:t>2.</w:t>
+      </w:r>
+      <w:r>
+        <w:rPr>
+          <w:b/>
+          <w:bCs/>
+        </w:rPr>
+        <w:t xml:space="preserve"> </w:t>
+      </w:r>
+      <w:r>
+        <w:t>(Root folder) -</w:t>
+      </w:r>
+      <w:r>
+        <w:rPr>
+          <w:b/>
+          <w:bCs/>
+        </w:rPr>
+        <w:t xml:space="preserve"> </w:t>
+      </w:r>
+      <w:r>
+        <w:rPr>
+          <w:b/>
+          <w:bCs/>
+        </w:rPr>
+        <w:t>python -m notebook</w:t>
+      </w:r>
+    </w:p>
+    <w:p/>
+    <w:p>
+      <w:pPr>
+        <w:pBdr>
+          <w:top w:val="single" w:sz="6" w:space="1" w:color="auto"/>
+          <w:bottom w:val="single" w:sz="6" w:space="1" w:color="auto"/>
+        </w:pBdr>
+      </w:pPr>
+    </w:p>
+    <w:p/>
+    <w:p>
+      <w:pPr>
+        <w:pStyle w:val="ListParagraph"/>
+        <w:numPr>
+          <w:ilvl w:val="0"/>
+          <w:numId w:val="2"/>
+        </w:numPr>
+        <w:rPr>
+          <w:sz w:val="28"/>
+          <w:szCs w:val="28"/>
+        </w:rPr>
+      </w:pPr>
+      <w:r>
+        <w:rPr>
+          <w:sz w:val="28"/>
+          <w:szCs w:val="28"/>
+        </w:rPr>
+        <w:t>Because metadata is important for RAG.</w:t>
+      </w:r>
+    </w:p>
+    <w:p>
+      <w:pPr>
+        <w:ind w:left="360"/>
+      </w:pPr>
+    </w:p>
     <w:p/>
     <w:p/>
     <w:p/>
@@ -1108,9 +1228,9 @@
 <file path=word/numbering.xml><?xml version="1.0" encoding="utf-8"?>
 <w:numbering xmlns:wpc="http://schemas.microsoft.com/office/word/2010/wordprocessingCanvas" xmlns:cx="http://schemas.microsoft.com/office/drawing/2014/chartex" xmlns:cx1="http://schemas.microsoft.com/office/drawing/2015/9/8/chartex" xmlns:cx2="http://schemas.microsoft.com/office/drawing/2015/10/21/chartex" xmlns:cx3="http://schemas.microsoft.com/office/drawing/2016/5/9/chartex" xmlns:cx4="http://schemas.microsoft.com/office/drawing/2016/5/10/chartex" xmlns:cx5="http://schemas.microsoft.com/office/drawing/2016/5/11/chartex" xmlns:cx6="http://schemas.microsoft.com/office/drawing/2016/5/12/chartex" xmlns:cx7="http://schemas.microsoft.com/office/drawing/2016/5/13/chartex" xmlns:cx8="http://schemas.microsoft.com/office/drawing/2016/5/14/chartex" xmlns:mc="http://schemas.openxmlformats.org/markup-compatibility/2006" xmlns:aink="http://schemas.microsoft.com/office/drawing/2016/ink" xmlns:am3d="http://schemas.microsoft.com/office/drawing/2017/model3d" xmlns:o="urn:schemas-microsoft-com:office:office" xmlns:oel="http://schemas.microsoft.com/office/2019/extlst" xmlns:r="http://schemas.openxmlformats.org/officeDocument/2006/relationships" xmlns:m="http://schemas.openxmlformats.org/officeDocument/2006/math" xmlns:v="urn:schemas-microsoft-com:vml" xmlns:wp14="http://schemas.microsoft.com/office/word/2010/wordprocessingDrawing" xmlns:wp="http://schemas.openxmlformats.org/drawingml/2006/wordprocessingDrawing" xmlns:w10="urn:schemas-microsoft-com:office:word" xmlns:w="http://schemas.openxmlformats.org/wordprocessingml/2006/main" xmlns:w14="http://schemas.microsoft.com/office/word/2010/wordml" xmlns:w15="http://schemas.microsoft.com/office/word/2012/wordml" xmlns:w16cex="http://schemas.microsoft.com/office/word/2018/wordml/cex" xmlns:w16cid="http://schemas.microsoft.com/office/word/2016/wordml/cid" xmlns:w16="http://schemas.microsoft.com/office/word/2018/wordml" xmlns:w16du="http://schemas.microsoft.com/office/word/2023/wordml/word16du" xmlns:w16sdtdh="http://schemas.microsoft.com/office/word/2020/wordml/sdtdatahash" xmlns:w16sdtfl="http://schemas.microsoft.com/office/word/2024/wordml/sdtformatlock" xmlns:w16se="http://schemas.microsoft.com/office/word/2015/wordml/symex" xmlns:wpg="http://schemas.microsoft.com/office/word/2010/wordprocessingGroup" xmlns:wpi="http://schemas.microsoft.com/office/word/2010/wordprocessingInk" xmlns:wne="http://schemas.microsoft.com/office/word/2006/wordml" xmlns:wps="http://schemas.microsoft.com/office/word/2010/wordprocessingShape" mc:Ignorable="w14 w15 w16se w16cid w16 w16cex w16sdtdh w16sdtfl w16du wp14">
   <w:abstractNum w:abstractNumId="0" w15:restartNumberingAfterBreak="0">
-    <w:nsid w:val="79AC0D9D"/>
+    <w:nsid w:val="01DD1D69"/>
     <w:multiLevelType w:val="hybridMultilevel"/>
-    <w:tmpl w:val="AE1869F2"/>
+    <w:tmpl w:val="49C8DF5E"/>
     <w:lvl w:ilvl="0" w:tplc="BFDCF000">
       <w:numFmt w:val="bullet"/>
       <w:lvlText w:val=""/>
@@ -1219,7 +1339,122 @@
       </w:rPr>
     </w:lvl>
   </w:abstractNum>
+  <w:abstractNum w:abstractNumId="1" w15:restartNumberingAfterBreak="0">
+    <w:nsid w:val="79AC0D9D"/>
+    <w:multiLevelType w:val="hybridMultilevel"/>
+    <w:tmpl w:val="AE1869F2"/>
+    <w:lvl w:ilvl="0" w:tplc="BFDCF000">
+      <w:numFmt w:val="bullet"/>
+      <w:lvlText w:val=""/>
+      <w:lvlJc w:val="left"/>
+      <w:pPr>
+        <w:ind w:left="720" w:hanging="360"/>
+      </w:pPr>
+      <w:rPr>
+        <w:rFonts w:ascii="Wingdings" w:eastAsiaTheme="minorHAnsi" w:hAnsi="Wingdings" w:cstheme="minorBidi" w:hint="default"/>
+      </w:rPr>
+    </w:lvl>
+    <w:lvl w:ilvl="1" w:tplc="40090003" w:tentative="1">
+      <w:start w:val="1"/>
+      <w:numFmt w:val="bullet"/>
+      <w:lvlText w:val="o"/>
+      <w:lvlJc w:val="left"/>
+      <w:pPr>
+        <w:ind w:left="1440" w:hanging="360"/>
+      </w:pPr>
+      <w:rPr>
+        <w:rFonts w:ascii="Courier New" w:hAnsi="Courier New" w:cs="Courier New" w:hint="default"/>
+      </w:rPr>
+    </w:lvl>
+    <w:lvl w:ilvl="2" w:tplc="40090005" w:tentative="1">
+      <w:start w:val="1"/>
+      <w:numFmt w:val="bullet"/>
+      <w:lvlText w:val=""/>
+      <w:lvlJc w:val="left"/>
+      <w:pPr>
+        <w:ind w:left="2160" w:hanging="360"/>
+      </w:pPr>
+      <w:rPr>
+        <w:rFonts w:ascii="Wingdings" w:hAnsi="Wingdings" w:hint="default"/>
+      </w:rPr>
+    </w:lvl>
+    <w:lvl w:ilvl="3" w:tplc="40090001" w:tentative="1">
+      <w:start w:val="1"/>
+      <w:numFmt w:val="bullet"/>
+      <w:lvlText w:val=""/>
+      <w:lvlJc w:val="left"/>
+      <w:pPr>
+        <w:ind w:left="2880" w:hanging="360"/>
+      </w:pPr>
+      <w:rPr>
+        <w:rFonts w:ascii="Symbol" w:hAnsi="Symbol" w:hint="default"/>
+      </w:rPr>
+    </w:lvl>
+    <w:lvl w:ilvl="4" w:tplc="40090003" w:tentative="1">
+      <w:start w:val="1"/>
+      <w:numFmt w:val="bullet"/>
+      <w:lvlText w:val="o"/>
+      <w:lvlJc w:val="left"/>
+      <w:pPr>
+        <w:ind w:left="3600" w:hanging="360"/>
+      </w:pPr>
+      <w:rPr>
+        <w:rFonts w:ascii="Courier New" w:hAnsi="Courier New" w:cs="Courier New" w:hint="default"/>
+      </w:rPr>
+    </w:lvl>
+    <w:lvl w:ilvl="5" w:tplc="40090005" w:tentative="1">
+      <w:start w:val="1"/>
+      <w:numFmt w:val="bullet"/>
+      <w:lvlText w:val=""/>
+      <w:lvlJc w:val="left"/>
+      <w:pPr>
+        <w:ind w:left="4320" w:hanging="360"/>
+      </w:pPr>
+      <w:rPr>
+        <w:rFonts w:ascii="Wingdings" w:hAnsi="Wingdings" w:hint="default"/>
+      </w:rPr>
+    </w:lvl>
+    <w:lvl w:ilvl="6" w:tplc="40090001" w:tentative="1">
+      <w:start w:val="1"/>
+      <w:numFmt w:val="bullet"/>
+      <w:lvlText w:val=""/>
+      <w:lvlJc w:val="left"/>
+      <w:pPr>
+        <w:ind w:left="5040" w:hanging="360"/>
+      </w:pPr>
+      <w:rPr>
+        <w:rFonts w:ascii="Symbol" w:hAnsi="Symbol" w:hint="default"/>
+      </w:rPr>
+    </w:lvl>
+    <w:lvl w:ilvl="7" w:tplc="40090003" w:tentative="1">
+      <w:start w:val="1"/>
+      <w:numFmt w:val="bullet"/>
+      <w:lvlText w:val="o"/>
+      <w:lvlJc w:val="left"/>
+      <w:pPr>
+        <w:ind w:left="5760" w:hanging="360"/>
+      </w:pPr>
+      <w:rPr>
+        <w:rFonts w:ascii="Courier New" w:hAnsi="Courier New" w:cs="Courier New" w:hint="default"/>
+      </w:rPr>
+    </w:lvl>
+    <w:lvl w:ilvl="8" w:tplc="40090005" w:tentative="1">
+      <w:start w:val="1"/>
+      <w:numFmt w:val="bullet"/>
+      <w:lvlText w:val=""/>
+      <w:lvlJc w:val="left"/>
+      <w:pPr>
+        <w:ind w:left="6480" w:hanging="360"/>
+      </w:pPr>
+      <w:rPr>
+        <w:rFonts w:ascii="Wingdings" w:hAnsi="Wingdings" w:hint="default"/>
+      </w:rPr>
+    </w:lvl>
+  </w:abstractNum>
   <w:num w:numId="1" w16cid:durableId="1175537981">
+    <w:abstractNumId w:val="1"/>
+  </w:num>
+  <w:num w:numId="2" w16cid:durableId="1924678913">
     <w:abstractNumId w:val="0"/>
   </w:num>
 </w:numbering>

</xml_diff>

<commit_message>
Initial commit for traditional RAG v1
</commit_message>
<xml_diff>
--- a/Notes_related_project.docx
+++ b/Notes_related_project.docx
@@ -1106,7 +1106,11 @@
         <w:t>python -m notebook</w:t>
       </w:r>
     </w:p>
-    <w:p/>
+    <w:p>
+      <w:r>
+        <w:t>3. ctrl + c to stop the server ..</w:t>
+      </w:r>
+    </w:p>
     <w:p>
       <w:pPr>
         <w:pBdr>
@@ -1138,9 +1142,56 @@
     </w:p>
     <w:p>
       <w:pPr>
-        <w:ind w:left="360"/>
-      </w:pPr>
-    </w:p>
+        <w:pStyle w:val="pdq2pgselectionanchorcontainer"/>
+        <w:numPr>
+          <w:ilvl w:val="0"/>
+          <w:numId w:val="2"/>
+        </w:numPr>
+      </w:pPr>
+      <w:r>
+        <w:t>Don't think:</w:t>
+      </w:r>
+    </w:p>
+    <w:p>
+      <w:pPr>
+        <w:pStyle w:val="NormalWeb"/>
+        <w:numPr>
+          <w:ilvl w:val="0"/>
+          <w:numId w:val="2"/>
+        </w:numPr>
+      </w:pPr>
+      <w:r>
+        <w:t>"Transform PDF → replace the original PDF."</w:t>
+      </w:r>
+    </w:p>
+    <w:p>
+      <w:pPr>
+        <w:pStyle w:val="NormalWeb"/>
+        <w:numPr>
+          <w:ilvl w:val="0"/>
+          <w:numId w:val="2"/>
+        </w:numPr>
+      </w:pPr>
+      <w:r>
+        <w:t>Instead:</w:t>
+      </w:r>
+    </w:p>
+    <w:p>
+      <w:pPr>
+        <w:pStyle w:val="NormalWeb"/>
+        <w:numPr>
+          <w:ilvl w:val="0"/>
+          <w:numId w:val="2"/>
+        </w:numPr>
+      </w:pPr>
+      <w:r>
+        <w:rPr>
+          <w:rStyle w:val="Strong"/>
+        </w:rPr>
+        <w:t>Raw data stays immutable. Transformations create new representations.</w:t>
+      </w:r>
+    </w:p>
+    <w:p/>
     <w:p/>
     <w:p/>
     <w:p/>
@@ -2376,6 +2427,52 @@
       <w:spacing w:val="5"/>
     </w:rPr>
   </w:style>
+  <w:style w:type="paragraph" w:customStyle="1" w:styleId="pdq2pgselectionanchorcontainer">
+    <w:name w:val="pdq2pg_selectionanchorcontainer"/>
+    <w:basedOn w:val="Normal"/>
+    <w:rsid w:val="00FB3F98"/>
+    <w:pPr>
+      <w:spacing w:before="100" w:beforeAutospacing="1" w:after="100" w:afterAutospacing="1" w:line="240" w:lineRule="auto"/>
+    </w:pPr>
+    <w:rPr>
+      <w:rFonts w:ascii="Times New Roman" w:eastAsia="Times New Roman" w:hAnsi="Times New Roman" w:cs="Times New Roman"/>
+      <w:kern w:val="0"/>
+      <w:sz w:val="24"/>
+      <w:szCs w:val="24"/>
+      <w:lang w:eastAsia="en-IN"/>
+      <w14:ligatures w14:val="none"/>
+    </w:rPr>
+  </w:style>
+  <w:style w:type="paragraph" w:styleId="NormalWeb">
+    <w:name w:val="Normal (Web)"/>
+    <w:basedOn w:val="Normal"/>
+    <w:uiPriority w:val="99"/>
+    <w:semiHidden/>
+    <w:unhideWhenUsed/>
+    <w:rsid w:val="00FB3F98"/>
+    <w:pPr>
+      <w:spacing w:before="100" w:beforeAutospacing="1" w:after="100" w:afterAutospacing="1" w:line="240" w:lineRule="auto"/>
+    </w:pPr>
+    <w:rPr>
+      <w:rFonts w:ascii="Times New Roman" w:eastAsia="Times New Roman" w:hAnsi="Times New Roman" w:cs="Times New Roman"/>
+      <w:kern w:val="0"/>
+      <w:sz w:val="24"/>
+      <w:szCs w:val="24"/>
+      <w:lang w:eastAsia="en-IN"/>
+      <w14:ligatures w14:val="none"/>
+    </w:rPr>
+  </w:style>
+  <w:style w:type="character" w:styleId="Strong">
+    <w:name w:val="Strong"/>
+    <w:basedOn w:val="DefaultParagraphFont"/>
+    <w:uiPriority w:val="22"/>
+    <w:qFormat/>
+    <w:rsid w:val="00FB3F98"/>
+    <w:rPr>
+      <w:b/>
+      <w:bCs/>
+    </w:rPr>
+  </w:style>
 </w:styles>
 </file>
 

</xml_diff>

<commit_message>
added llm to rag
</commit_message>
<xml_diff>
--- a/Notes_related_project.docx
+++ b/Notes_related_project.docx
@@ -1074,7 +1074,21 @@
           <w:b/>
           <w:bCs/>
         </w:rPr>
-        <w:t>.venv\Script\activate</w:t>
+        <w:t>.venv\Scrip</w:t>
+      </w:r>
+      <w:r>
+        <w:rPr>
+          <w:b/>
+          <w:bCs/>
+        </w:rPr>
+        <w:t>s</w:t>
+      </w:r>
+      <w:r>
+        <w:rPr>
+          <w:b/>
+          <w:bCs/>
+        </w:rPr>
+        <w:t>t\activate</w:t>
       </w:r>
     </w:p>
     <w:p>
@@ -1089,7 +1103,10 @@
         <w:t xml:space="preserve"> </w:t>
       </w:r>
       <w:r>
-        <w:t>(Root folder) -</w:t>
+        <w:t>(Root folder)</w:t>
+      </w:r>
+      <w:r>
+        <w:t xml:space="preserve">:- </w:t>
       </w:r>
       <w:r>
         <w:rPr>
@@ -2114,6 +2131,7 @@
   <w:style w:type="character" w:default="1" w:styleId="DefaultParagraphFont">
     <w:name w:val="Default Paragraph Font"/>
     <w:uiPriority w:val="1"/>
+    <w:semiHidden/>
     <w:unhideWhenUsed/>
   </w:style>
   <w:style w:type="table" w:default="1" w:styleId="TableNormal">

</xml_diff>